<commit_message>
add all time display
</commit_message>
<xml_diff>
--- a/template/surface/TEMPLATE.docx
+++ b/template/surface/TEMPLATE.docx
@@ -1,13 +1,13 @@
 
 <file path=word/document.xml><?xml version="1.0" encoding="utf-8"?>
-<w:document xmlns:wpc="http://schemas.microsoft.com/office/word/2010/wordprocessingCanvas" xmlns:cx="http://schemas.microsoft.com/office/drawing/2014/chartex" xmlns:cx1="http://schemas.microsoft.com/office/drawing/2015/9/8/chartex" xmlns:cx2="http://schemas.microsoft.com/office/drawing/2015/10/21/chartex" xmlns:cx3="http://schemas.microsoft.com/office/drawing/2016/5/9/chartex" xmlns:cx4="http://schemas.microsoft.com/office/drawing/2016/5/10/chartex" xmlns:cx5="http://schemas.microsoft.com/office/drawing/2016/5/11/chartex" xmlns:cx6="http://schemas.microsoft.com/office/drawing/2016/5/12/chartex" xmlns:cx7="http://schemas.microsoft.com/office/drawing/2016/5/13/chartex" xmlns:cx8="http://schemas.microsoft.com/office/drawing/2016/5/14/chartex" xmlns:mc="http://schemas.openxmlformats.org/markup-compatibility/2006" xmlns:aink="http://schemas.microsoft.com/office/drawing/2016/ink" xmlns:am3d="http://schemas.microsoft.com/office/drawing/2017/model3d" xmlns:o="urn:schemas-microsoft-com:office:office" xmlns:oel="http://schemas.microsoft.com/office/2019/extlst" xmlns:r="http://schemas.openxmlformats.org/officeDocument/2006/relationships" xmlns:m="http://schemas.openxmlformats.org/officeDocument/2006/math" xmlns:v="urn:schemas-microsoft-com:vml" xmlns:wp14="http://schemas.microsoft.com/office/word/2010/wordprocessingDrawing" xmlns:wp="http://schemas.openxmlformats.org/drawingml/2006/wordprocessingDrawing" xmlns:w10="urn:schemas-microsoft-com:office:word" xmlns:w="http://schemas.openxmlformats.org/wordprocessingml/2006/main" xmlns:w14="http://schemas.microsoft.com/office/word/2010/wordml" xmlns:w15="http://schemas.microsoft.com/office/word/2012/wordml" xmlns:w16cex="http://schemas.microsoft.com/office/word/2018/wordml/cex" xmlns:w16cid="http://schemas.microsoft.com/office/word/2016/wordml/cid" xmlns:w16="http://schemas.microsoft.com/office/word/2018/wordml" xmlns:w16sdtdh="http://schemas.microsoft.com/office/word/2020/wordml/sdtdatahash" xmlns:w16se="http://schemas.microsoft.com/office/word/2015/wordml/symex" xmlns:wpg="http://schemas.microsoft.com/office/word/2010/wordprocessingGroup" xmlns:wpi="http://schemas.microsoft.com/office/word/2010/wordprocessingInk" xmlns:wne="http://schemas.microsoft.com/office/word/2006/wordml" xmlns:wps="http://schemas.microsoft.com/office/word/2010/wordprocessingShape" mc:Ignorable="w14 w15 w16se w16cid w16 w16cex w16sdtdh wp14">
+<w:document xmlns:wpc="http://schemas.microsoft.com/office/word/2010/wordprocessingCanvas" xmlns:cx="http://schemas.microsoft.com/office/drawing/2014/chartex" xmlns:cx1="http://schemas.microsoft.com/office/drawing/2015/9/8/chartex" xmlns:cx2="http://schemas.microsoft.com/office/drawing/2015/10/21/chartex" xmlns:cx3="http://schemas.microsoft.com/office/drawing/2016/5/9/chartex" xmlns:cx4="http://schemas.microsoft.com/office/drawing/2016/5/10/chartex" xmlns:cx5="http://schemas.microsoft.com/office/drawing/2016/5/11/chartex" xmlns:cx6="http://schemas.microsoft.com/office/drawing/2016/5/12/chartex" xmlns:cx7="http://schemas.microsoft.com/office/drawing/2016/5/13/chartex" xmlns:cx8="http://schemas.microsoft.com/office/drawing/2016/5/14/chartex" xmlns:mc="http://schemas.openxmlformats.org/markup-compatibility/2006" xmlns:aink="http://schemas.microsoft.com/office/drawing/2016/ink" xmlns:am3d="http://schemas.microsoft.com/office/drawing/2017/model3d" xmlns:o="urn:schemas-microsoft-com:office:office" xmlns:oel="http://schemas.microsoft.com/office/2019/extlst" xmlns:r="http://schemas.openxmlformats.org/officeDocument/2006/relationships" xmlns:m="http://schemas.openxmlformats.org/officeDocument/2006/math" xmlns:v="urn:schemas-microsoft-com:vml" xmlns:wp14="http://schemas.microsoft.com/office/word/2010/wordprocessingDrawing" xmlns:wp="http://schemas.openxmlformats.org/drawingml/2006/wordprocessingDrawing" xmlns:w10="urn:schemas-microsoft-com:office:word" xmlns:w="http://schemas.openxmlformats.org/wordprocessingml/2006/main" xmlns:w14="http://schemas.microsoft.com/office/word/2010/wordml" xmlns:w15="http://schemas.microsoft.com/office/word/2012/wordml" xmlns:w16cex="http://schemas.microsoft.com/office/word/2018/wordml/cex" xmlns:w16cid="http://schemas.microsoft.com/office/word/2016/wordml/cid" xmlns:w16="http://schemas.microsoft.com/office/word/2018/wordml" xmlns:w16du="http://schemas.microsoft.com/office/word/2023/wordml/word16du" xmlns:w16sdtdh="http://schemas.microsoft.com/office/word/2020/wordml/sdtdatahash" xmlns:w16se="http://schemas.microsoft.com/office/word/2015/wordml/symex" xmlns:wpg="http://schemas.microsoft.com/office/word/2010/wordprocessingGroup" xmlns:wpi="http://schemas.microsoft.com/office/word/2010/wordprocessingInk" xmlns:wne="http://schemas.microsoft.com/office/word/2006/wordml" xmlns:wps="http://schemas.microsoft.com/office/word/2010/wordprocessingShape" mc:Ignorable="w14 w15 w16se w16cid w16 w16cex w16sdtdh w16du wp14">
   <w:body>
     <w:p>
       <w:pPr>
         <w:ind w:firstLineChars="100" w:firstLine="301"/>
         <w:jc w:val="center"/>
         <w:rPr>
-          <w:rFonts w:ascii="宋体" w:hAnsi="宋体" w:cs="宋体"/>
+          <w:rFonts w:ascii="宋体" w:hAnsi="宋体" w:cs="宋体" w:hint="eastAsia"/>
           <w:b/>
           <w:bCs/>
           <w:sz w:val="30"/>
@@ -31,7 +31,7 @@
         <w:snapToGrid w:val="0"/>
         <w:jc w:val="left"/>
         <w:rPr>
-          <w:rFonts w:ascii="宋体" w:hAnsi="宋体" w:cs="宋体"/>
+          <w:rFonts w:ascii="宋体" w:hAnsi="宋体" w:cs="宋体" w:hint="eastAsia"/>
           <w:szCs w:val="21"/>
         </w:rPr>
       </w:pPr>
@@ -49,7 +49,7 @@
         <w:snapToGrid w:val="0"/>
         <w:jc w:val="left"/>
         <w:rPr>
-          <w:rFonts w:ascii="宋体" w:hAnsi="宋体" w:cs="宋体"/>
+          <w:rFonts w:ascii="宋体" w:hAnsi="宋体" w:cs="宋体" w:hint="eastAsia"/>
           <w:szCs w:val="21"/>
         </w:rPr>
       </w:pPr>
@@ -118,7 +118,7 @@
               <w:spacing w:before="60"/>
               <w:jc w:val="center"/>
               <w:rPr>
-                <w:rFonts w:ascii="宋体" w:hAnsi="宋体" w:cs="宋体"/>
+                <w:rFonts w:ascii="宋体" w:hAnsi="宋体" w:cs="宋体" w:hint="eastAsia"/>
                 <w:szCs w:val="21"/>
               </w:rPr>
             </w:pPr>
@@ -149,7 +149,7 @@
               <w:spacing w:before="60"/>
               <w:jc w:val="center"/>
               <w:rPr>
-                <w:rFonts w:ascii="楷体" w:eastAsia="楷体" w:hAnsi="楷体" w:cs="宋体"/>
+                <w:rFonts w:ascii="楷体" w:eastAsia="楷体" w:hAnsi="楷体" w:cs="宋体" w:hint="eastAsia"/>
                 <w:szCs w:val="21"/>
               </w:rPr>
             </w:pPr>
@@ -187,7 +187,7 @@
               <w:spacing w:before="60"/>
               <w:jc w:val="center"/>
               <w:rPr>
-                <w:rFonts w:ascii="宋体" w:hAnsi="宋体" w:cs="宋体"/>
+                <w:rFonts w:ascii="宋体" w:hAnsi="宋体" w:cs="宋体" w:hint="eastAsia"/>
                 <w:szCs w:val="21"/>
               </w:rPr>
             </w:pPr>
@@ -218,7 +218,7 @@
               <w:spacing w:before="60"/>
               <w:jc w:val="center"/>
               <w:rPr>
-                <w:rFonts w:ascii="宋体" w:hAnsi="宋体" w:cs="宋体"/>
+                <w:rFonts w:ascii="宋体" w:hAnsi="宋体" w:cs="宋体" w:hint="eastAsia"/>
                 <w:szCs w:val="21"/>
               </w:rPr>
             </w:pPr>
@@ -246,7 +246,7 @@
               <w:spacing w:before="60"/>
               <w:jc w:val="center"/>
               <w:rPr>
-                <w:rFonts w:ascii="宋体" w:hAnsi="宋体" w:cs="宋体"/>
+                <w:rFonts w:ascii="宋体" w:hAnsi="宋体" w:cs="宋体" w:hint="eastAsia"/>
                 <w:szCs w:val="21"/>
               </w:rPr>
             </w:pPr>
@@ -277,7 +277,7 @@
               <w:spacing w:before="60"/>
               <w:jc w:val="center"/>
               <w:rPr>
-                <w:rFonts w:ascii="宋体" w:hAnsi="宋体" w:cs="宋体"/>
+                <w:rFonts w:ascii="宋体" w:hAnsi="宋体" w:cs="宋体" w:hint="eastAsia"/>
                 <w:szCs w:val="21"/>
               </w:rPr>
             </w:pPr>
@@ -301,7 +301,7 @@
               <w:spacing w:before="60"/>
               <w:jc w:val="center"/>
               <w:rPr>
-                <w:rFonts w:ascii="宋体" w:hAnsi="宋体" w:cs="宋体"/>
+                <w:rFonts w:ascii="宋体" w:hAnsi="宋体" w:cs="宋体" w:hint="eastAsia"/>
                 <w:szCs w:val="21"/>
               </w:rPr>
             </w:pPr>
@@ -332,7 +332,7 @@
               <w:spacing w:before="60"/>
               <w:jc w:val="center"/>
               <w:rPr>
-                <w:rFonts w:ascii="宋体" w:hAnsi="宋体" w:cs="宋体"/>
+                <w:rFonts w:ascii="宋体" w:hAnsi="宋体" w:cs="宋体" w:hint="eastAsia"/>
                 <w:szCs w:val="21"/>
               </w:rPr>
             </w:pPr>
@@ -360,7 +360,7 @@
               <w:spacing w:before="60"/>
               <w:jc w:val="center"/>
               <w:rPr>
-                <w:rFonts w:ascii="宋体" w:hAnsi="宋体" w:cs="宋体"/>
+                <w:rFonts w:ascii="宋体" w:hAnsi="宋体" w:cs="宋体" w:hint="eastAsia"/>
                 <w:szCs w:val="21"/>
               </w:rPr>
             </w:pPr>
@@ -391,7 +391,7 @@
               <w:spacing w:before="60"/>
               <w:jc w:val="center"/>
               <w:rPr>
-                <w:rFonts w:ascii="宋体" w:hAnsi="宋体" w:cs="宋体"/>
+                <w:rFonts w:ascii="宋体" w:hAnsi="宋体" w:cs="宋体" w:hint="eastAsia"/>
                 <w:bCs/>
                 <w:szCs w:val="21"/>
               </w:rPr>
@@ -416,7 +416,7 @@
               <w:spacing w:before="60"/>
               <w:jc w:val="center"/>
               <w:rPr>
-                <w:rFonts w:ascii="宋体" w:hAnsi="宋体" w:cs="宋体"/>
+                <w:rFonts w:ascii="宋体" w:hAnsi="宋体" w:cs="宋体" w:hint="eastAsia"/>
                 <w:bCs/>
                 <w:szCs w:val="21"/>
               </w:rPr>
@@ -450,7 +450,7 @@
               <w:jc w:val="center"/>
               <w:textAlignment w:val="center"/>
               <w:rPr>
-                <w:rFonts w:ascii="宋体" w:hAnsi="宋体" w:cs="宋体"/>
+                <w:rFonts w:ascii="宋体" w:hAnsi="宋体" w:cs="宋体" w:hint="eastAsia"/>
                 <w:color w:val="000000"/>
                 <w:szCs w:val="21"/>
               </w:rPr>
@@ -475,7 +475,7 @@
               <w:spacing w:before="60"/>
               <w:jc w:val="center"/>
               <w:rPr>
-                <w:rFonts w:ascii="宋体" w:hAnsi="宋体" w:cs="宋体"/>
+                <w:rFonts w:ascii="宋体" w:hAnsi="宋体" w:cs="宋体" w:hint="eastAsia"/>
                 <w:szCs w:val="21"/>
               </w:rPr>
             </w:pPr>
@@ -506,7 +506,7 @@
               <w:spacing w:before="60"/>
               <w:jc w:val="center"/>
               <w:rPr>
-                <w:rFonts w:ascii="宋体" w:hAnsi="宋体" w:cs="宋体"/>
+                <w:rFonts w:ascii="宋体" w:hAnsi="宋体" w:cs="宋体" w:hint="eastAsia"/>
                 <w:szCs w:val="21"/>
               </w:rPr>
             </w:pPr>
@@ -535,11 +535,10 @@
               <w:spacing w:before="60"/>
               <w:jc w:val="center"/>
               <w:rPr>
-                <w:rFonts w:ascii="宋体" w:hAnsi="宋体" w:cs="宋体"/>
-                <w:szCs w:val="21"/>
-              </w:rPr>
-            </w:pPr>
-            <w:proofErr w:type="gramStart"/>
+                <w:rFonts w:ascii="宋体" w:hAnsi="宋体" w:cs="宋体" w:hint="eastAsia"/>
+                <w:szCs w:val="21"/>
+              </w:rPr>
+            </w:pPr>
             <w:r>
               <w:rPr>
                 <w:rFonts w:ascii="宋体" w:hAnsi="宋体" w:cs="宋体" w:hint="eastAsia"/>
@@ -547,7 +546,6 @@
               </w:rPr>
               <w:t>检件编号</w:t>
             </w:r>
-            <w:proofErr w:type="gramEnd"/>
           </w:p>
         </w:tc>
         <w:tc>
@@ -566,7 +564,7 @@
               <w:spacing w:before="60"/>
               <w:jc w:val="center"/>
               <w:rPr>
-                <w:rFonts w:ascii="宋体" w:hAnsi="宋体" w:cs="宋体"/>
+                <w:rFonts w:ascii="宋体" w:hAnsi="宋体" w:cs="宋体" w:hint="eastAsia"/>
                 <w:color w:val="000000" w:themeColor="text1"/>
                 <w:szCs w:val="21"/>
               </w:rPr>
@@ -585,7 +583,7 @@
               <w:spacing w:before="60"/>
               <w:jc w:val="center"/>
               <w:rPr>
-                <w:rFonts w:ascii="宋体" w:hAnsi="宋体" w:cs="宋体"/>
+                <w:rFonts w:ascii="宋体" w:hAnsi="宋体" w:cs="宋体" w:hint="eastAsia"/>
                 <w:color w:val="000000" w:themeColor="text1"/>
                 <w:szCs w:val="21"/>
               </w:rPr>
@@ -620,7 +618,7 @@
               <w:spacing w:before="60"/>
               <w:jc w:val="center"/>
               <w:rPr>
-                <w:rFonts w:ascii="宋体" w:hAnsi="宋体" w:cs="宋体"/>
+                <w:rFonts w:ascii="宋体" w:hAnsi="宋体" w:cs="宋体" w:hint="eastAsia"/>
                 <w:color w:val="000000" w:themeColor="text1"/>
                 <w:szCs w:val="21"/>
               </w:rPr>
@@ -652,7 +650,7 @@
               <w:spacing w:before="60"/>
               <w:jc w:val="center"/>
               <w:rPr>
-                <w:rFonts w:ascii="宋体" w:hAnsi="宋体" w:cs="宋体"/>
+                <w:rFonts w:ascii="宋体" w:hAnsi="宋体" w:cs="宋体" w:hint="eastAsia"/>
                 <w:color w:val="000000" w:themeColor="text1"/>
                 <w:szCs w:val="21"/>
               </w:rPr>
@@ -684,7 +682,7 @@
               <w:spacing w:before="60"/>
               <w:jc w:val="center"/>
               <w:rPr>
-                <w:rFonts w:ascii="宋体" w:hAnsi="宋体" w:cs="宋体"/>
+                <w:rFonts w:ascii="宋体" w:hAnsi="宋体" w:cs="宋体" w:hint="eastAsia"/>
                 <w:color w:val="000000" w:themeColor="text1"/>
                 <w:szCs w:val="21"/>
               </w:rPr>
@@ -703,7 +701,7 @@
               <w:spacing w:before="60"/>
               <w:jc w:val="center"/>
               <w:rPr>
-                <w:rFonts w:ascii="宋体" w:hAnsi="宋体" w:cs="宋体"/>
+                <w:rFonts w:ascii="宋体" w:hAnsi="宋体" w:cs="宋体" w:hint="eastAsia"/>
                 <w:color w:val="000000" w:themeColor="text1"/>
                 <w:szCs w:val="21"/>
               </w:rPr>
@@ -735,7 +733,7 @@
               <w:spacing w:before="60"/>
               <w:jc w:val="center"/>
               <w:rPr>
-                <w:rFonts w:ascii="宋体" w:hAnsi="宋体" w:cs="宋体"/>
+                <w:rFonts w:ascii="宋体" w:hAnsi="宋体" w:cs="宋体" w:hint="eastAsia"/>
                 <w:color w:val="000000" w:themeColor="text1"/>
                 <w:szCs w:val="21"/>
               </w:rPr>
@@ -772,7 +770,7 @@
               <w:spacing w:before="60"/>
               <w:jc w:val="center"/>
               <w:rPr>
-                <w:rFonts w:ascii="宋体" w:hAnsi="宋体" w:cs="宋体"/>
+                <w:rFonts w:ascii="宋体" w:hAnsi="宋体" w:cs="宋体" w:hint="eastAsia"/>
                 <w:szCs w:val="21"/>
               </w:rPr>
             </w:pPr>
@@ -794,7 +792,7 @@
               <w:spacing w:before="60"/>
               <w:jc w:val="center"/>
               <w:rPr>
-                <w:rFonts w:ascii="宋体" w:hAnsi="宋体" w:cs="宋体"/>
+                <w:rFonts w:ascii="宋体" w:hAnsi="宋体" w:cs="宋体" w:hint="eastAsia"/>
                 <w:szCs w:val="21"/>
               </w:rPr>
             </w:pPr>
@@ -817,7 +815,7 @@
               <w:spacing w:before="60"/>
               <w:jc w:val="center"/>
               <w:rPr>
-                <w:rFonts w:ascii="宋体" w:hAnsi="宋体" w:cs="宋体"/>
+                <w:rFonts w:ascii="宋体" w:hAnsi="宋体" w:cs="宋体" w:hint="eastAsia"/>
                 <w:szCs w:val="21"/>
               </w:rPr>
             </w:pPr>
@@ -840,7 +838,7 @@
               <w:spacing w:before="60"/>
               <w:jc w:val="center"/>
               <w:rPr>
-                <w:rFonts w:ascii="宋体" w:hAnsi="宋体" w:cs="宋体"/>
+                <w:rFonts w:ascii="宋体" w:hAnsi="宋体" w:cs="宋体" w:hint="eastAsia"/>
                 <w:szCs w:val="21"/>
               </w:rPr>
             </w:pPr>
@@ -863,7 +861,7 @@
               <w:spacing w:before="60"/>
               <w:jc w:val="center"/>
               <w:rPr>
-                <w:rFonts w:ascii="宋体" w:hAnsi="宋体" w:cs="宋体"/>
+                <w:rFonts w:ascii="宋体" w:hAnsi="宋体" w:cs="宋体" w:hint="eastAsia"/>
                 <w:szCs w:val="21"/>
               </w:rPr>
             </w:pPr>
@@ -886,7 +884,7 @@
               <w:spacing w:before="60"/>
               <w:jc w:val="center"/>
               <w:rPr>
-                <w:rFonts w:ascii="宋体" w:hAnsi="宋体" w:cs="宋体"/>
+                <w:rFonts w:ascii="宋体" w:hAnsi="宋体" w:cs="宋体" w:hint="eastAsia"/>
                 <w:szCs w:val="21"/>
               </w:rPr>
             </w:pPr>
@@ -915,7 +913,7 @@
               <w:spacing w:before="60"/>
               <w:jc w:val="center"/>
               <w:rPr>
-                <w:rFonts w:ascii="宋体" w:hAnsi="宋体" w:cs="宋体"/>
+                <w:rFonts w:ascii="宋体" w:hAnsi="宋体" w:cs="宋体" w:hint="eastAsia"/>
                 <w:szCs w:val="21"/>
               </w:rPr>
             </w:pPr>
@@ -952,7 +950,7 @@
               <w:jc w:val="center"/>
               <w:textAlignment w:val="center"/>
               <w:rPr>
-                <w:rFonts w:ascii="宋体" w:hAnsi="宋体" w:cs="宋体"/>
+                <w:rFonts w:ascii="宋体" w:hAnsi="宋体" w:cs="宋体" w:hint="eastAsia"/>
                 <w:color w:val="000000"/>
                 <w:sz w:val="15"/>
                 <w:szCs w:val="15"/>
@@ -1116,7 +1114,7 @@
               <w:jc w:val="center"/>
               <w:textAlignment w:val="center"/>
               <w:rPr>
-                <w:rFonts w:ascii="宋体" w:hAnsi="宋体" w:cs="宋体"/>
+                <w:rFonts w:ascii="宋体" w:hAnsi="宋体" w:cs="宋体" w:hint="eastAsia"/>
                 <w:color w:val="000000"/>
                 <w:sz w:val="15"/>
                 <w:szCs w:val="15"/>
@@ -1280,7 +1278,7 @@
               <w:jc w:val="center"/>
               <w:textAlignment w:val="center"/>
               <w:rPr>
-                <w:rFonts w:ascii="宋体" w:hAnsi="宋体" w:cs="宋体"/>
+                <w:rFonts w:ascii="宋体" w:hAnsi="宋体" w:cs="宋体" w:hint="eastAsia"/>
                 <w:color w:val="000000"/>
                 <w:sz w:val="15"/>
                 <w:szCs w:val="15"/>
@@ -1444,7 +1442,7 @@
               <w:jc w:val="center"/>
               <w:textAlignment w:val="center"/>
               <w:rPr>
-                <w:rFonts w:ascii="宋体" w:hAnsi="宋体" w:cs="宋体"/>
+                <w:rFonts w:ascii="宋体" w:hAnsi="宋体" w:cs="宋体" w:hint="eastAsia"/>
                 <w:color w:val="000000"/>
                 <w:sz w:val="15"/>
                 <w:szCs w:val="15"/>
@@ -1608,7 +1606,7 @@
               <w:jc w:val="center"/>
               <w:textAlignment w:val="center"/>
               <w:rPr>
-                <w:rFonts w:ascii="宋体" w:hAnsi="宋体" w:cs="宋体"/>
+                <w:rFonts w:ascii="宋体" w:hAnsi="宋体" w:cs="宋体" w:hint="eastAsia"/>
                 <w:color w:val="000000"/>
                 <w:sz w:val="15"/>
                 <w:szCs w:val="15"/>
@@ -1772,7 +1770,7 @@
               <w:jc w:val="center"/>
               <w:textAlignment w:val="center"/>
               <w:rPr>
-                <w:rFonts w:ascii="宋体" w:hAnsi="宋体" w:cs="宋体"/>
+                <w:rFonts w:ascii="宋体" w:hAnsi="宋体" w:cs="宋体" w:hint="eastAsia"/>
                 <w:color w:val="000000"/>
                 <w:sz w:val="15"/>
                 <w:szCs w:val="15"/>
@@ -1936,7 +1934,7 @@
               <w:jc w:val="center"/>
               <w:textAlignment w:val="center"/>
               <w:rPr>
-                <w:rFonts w:ascii="宋体" w:hAnsi="宋体" w:cs="宋体"/>
+                <w:rFonts w:ascii="宋体" w:hAnsi="宋体" w:cs="宋体" w:hint="eastAsia"/>
                 <w:color w:val="000000"/>
                 <w:sz w:val="15"/>
                 <w:szCs w:val="15"/>
@@ -2100,7 +2098,7 @@
               <w:jc w:val="center"/>
               <w:textAlignment w:val="center"/>
               <w:rPr>
-                <w:rFonts w:ascii="宋体" w:hAnsi="宋体" w:cs="宋体"/>
+                <w:rFonts w:ascii="宋体" w:hAnsi="宋体" w:cs="宋体" w:hint="eastAsia"/>
                 <w:color w:val="000000"/>
                 <w:sz w:val="15"/>
                 <w:szCs w:val="15"/>
@@ -2264,7 +2262,7 @@
               <w:jc w:val="center"/>
               <w:textAlignment w:val="center"/>
               <w:rPr>
-                <w:rFonts w:ascii="宋体" w:hAnsi="宋体" w:cs="宋体"/>
+                <w:rFonts w:ascii="宋体" w:hAnsi="宋体" w:cs="宋体" w:hint="eastAsia"/>
                 <w:color w:val="000000"/>
                 <w:sz w:val="15"/>
                 <w:szCs w:val="15"/>
@@ -2428,7 +2426,7 @@
               <w:jc w:val="center"/>
               <w:textAlignment w:val="center"/>
               <w:rPr>
-                <w:rFonts w:ascii="宋体" w:hAnsi="宋体" w:cs="宋体"/>
+                <w:rFonts w:ascii="宋体" w:hAnsi="宋体" w:cs="宋体" w:hint="eastAsia"/>
                 <w:color w:val="000000"/>
                 <w:sz w:val="15"/>
                 <w:szCs w:val="15"/>
@@ -2592,7 +2590,7 @@
               <w:jc w:val="center"/>
               <w:textAlignment w:val="center"/>
               <w:rPr>
-                <w:rFonts w:ascii="宋体" w:hAnsi="宋体" w:cs="宋体"/>
+                <w:rFonts w:ascii="宋体" w:hAnsi="宋体" w:cs="宋体" w:hint="eastAsia"/>
                 <w:color w:val="000000"/>
                 <w:sz w:val="15"/>
                 <w:szCs w:val="15"/>
@@ -2756,7 +2754,7 @@
               <w:jc w:val="center"/>
               <w:textAlignment w:val="center"/>
               <w:rPr>
-                <w:rFonts w:ascii="宋体" w:hAnsi="宋体" w:cs="宋体"/>
+                <w:rFonts w:ascii="宋体" w:hAnsi="宋体" w:cs="宋体" w:hint="eastAsia"/>
                 <w:color w:val="000000"/>
                 <w:sz w:val="15"/>
                 <w:szCs w:val="15"/>
@@ -2920,7 +2918,7 @@
               <w:jc w:val="center"/>
               <w:textAlignment w:val="center"/>
               <w:rPr>
-                <w:rFonts w:ascii="宋体" w:hAnsi="宋体" w:cs="宋体"/>
+                <w:rFonts w:ascii="宋体" w:hAnsi="宋体" w:cs="宋体" w:hint="eastAsia"/>
                 <w:color w:val="000000"/>
                 <w:sz w:val="15"/>
                 <w:szCs w:val="15"/>
@@ -3084,7 +3082,7 @@
               <w:jc w:val="center"/>
               <w:textAlignment w:val="center"/>
               <w:rPr>
-                <w:rFonts w:ascii="宋体" w:hAnsi="宋体" w:cs="宋体"/>
+                <w:rFonts w:ascii="宋体" w:hAnsi="宋体" w:cs="宋体" w:hint="eastAsia"/>
                 <w:color w:val="000000"/>
                 <w:sz w:val="15"/>
                 <w:szCs w:val="15"/>
@@ -3248,7 +3246,7 @@
               <w:jc w:val="center"/>
               <w:textAlignment w:val="center"/>
               <w:rPr>
-                <w:rFonts w:ascii="宋体" w:hAnsi="宋体" w:cs="宋体"/>
+                <w:rFonts w:ascii="宋体" w:hAnsi="宋体" w:cs="宋体" w:hint="eastAsia"/>
                 <w:color w:val="000000"/>
                 <w:sz w:val="15"/>
                 <w:szCs w:val="15"/>
@@ -3412,7 +3410,7 @@
               <w:jc w:val="center"/>
               <w:textAlignment w:val="center"/>
               <w:rPr>
-                <w:rFonts w:ascii="宋体" w:hAnsi="宋体" w:cs="宋体"/>
+                <w:rFonts w:ascii="宋体" w:hAnsi="宋体" w:cs="宋体" w:hint="eastAsia"/>
                 <w:color w:val="000000"/>
                 <w:sz w:val="15"/>
                 <w:szCs w:val="15"/>
@@ -3576,7 +3574,7 @@
               <w:jc w:val="center"/>
               <w:textAlignment w:val="center"/>
               <w:rPr>
-                <w:rFonts w:ascii="宋体" w:hAnsi="宋体" w:cs="宋体"/>
+                <w:rFonts w:ascii="宋体" w:hAnsi="宋体" w:cs="宋体" w:hint="eastAsia"/>
                 <w:color w:val="000000"/>
                 <w:sz w:val="15"/>
                 <w:szCs w:val="15"/>
@@ -3740,7 +3738,7 @@
               <w:jc w:val="center"/>
               <w:textAlignment w:val="center"/>
               <w:rPr>
-                <w:rFonts w:ascii="宋体" w:hAnsi="宋体" w:cs="宋体"/>
+                <w:rFonts w:ascii="宋体" w:hAnsi="宋体" w:cs="宋体" w:hint="eastAsia"/>
                 <w:color w:val="000000"/>
                 <w:sz w:val="15"/>
                 <w:szCs w:val="15"/>
@@ -3904,7 +3902,7 @@
               <w:jc w:val="center"/>
               <w:textAlignment w:val="center"/>
               <w:rPr>
-                <w:rFonts w:ascii="宋体" w:hAnsi="宋体" w:cs="宋体"/>
+                <w:rFonts w:ascii="宋体" w:hAnsi="宋体" w:cs="宋体" w:hint="eastAsia"/>
                 <w:color w:val="000000"/>
                 <w:sz w:val="15"/>
                 <w:szCs w:val="15"/>
@@ -4135,36 +4133,6 @@
               <w:spacing w:line="240" w:lineRule="atLeast"/>
               <w:jc w:val="right"/>
             </w:pPr>
-            <w:r>
-              <w:rPr>
-                <w:rFonts w:hint="eastAsia"/>
-              </w:rPr>
-              <w:t>年</w:t>
-            </w:r>
-            <w:r>
-              <w:rPr>
-                <w:rFonts w:hint="eastAsia"/>
-              </w:rPr>
-              <w:t xml:space="preserve">   </w:t>
-            </w:r>
-            <w:r>
-              <w:rPr>
-                <w:rFonts w:hint="eastAsia"/>
-              </w:rPr>
-              <w:t>月</w:t>
-            </w:r>
-            <w:r>
-              <w:rPr>
-                <w:rFonts w:hint="eastAsia"/>
-              </w:rPr>
-              <w:t xml:space="preserve">   </w:t>
-            </w:r>
-            <w:r>
-              <w:rPr>
-                <w:rFonts w:hint="eastAsia"/>
-              </w:rPr>
-              <w:t>日</w:t>
-            </w:r>
           </w:p>
         </w:tc>
         <w:tc>
@@ -4218,36 +4186,6 @@
               <w:spacing w:line="240" w:lineRule="atLeast"/>
               <w:jc w:val="right"/>
             </w:pPr>
-            <w:r>
-              <w:rPr>
-                <w:rFonts w:hint="eastAsia"/>
-              </w:rPr>
-              <w:t>年</w:t>
-            </w:r>
-            <w:r>
-              <w:rPr>
-                <w:rFonts w:hint="eastAsia"/>
-              </w:rPr>
-              <w:t xml:space="preserve">   </w:t>
-            </w:r>
-            <w:r>
-              <w:rPr>
-                <w:rFonts w:hint="eastAsia"/>
-              </w:rPr>
-              <w:t>月</w:t>
-            </w:r>
-            <w:r>
-              <w:rPr>
-                <w:rFonts w:hint="eastAsia"/>
-              </w:rPr>
-              <w:t xml:space="preserve">   </w:t>
-            </w:r>
-            <w:r>
-              <w:rPr>
-                <w:rFonts w:hint="eastAsia"/>
-              </w:rPr>
-              <w:t>日</w:t>
-            </w:r>
           </w:p>
         </w:tc>
         <w:tc>
@@ -4313,36 +4251,6 @@
               <w:spacing w:line="240" w:lineRule="atLeast"/>
               <w:jc w:val="right"/>
             </w:pPr>
-            <w:r>
-              <w:rPr>
-                <w:rFonts w:hint="eastAsia"/>
-              </w:rPr>
-              <w:t>年</w:t>
-            </w:r>
-            <w:r>
-              <w:rPr>
-                <w:rFonts w:hint="eastAsia"/>
-              </w:rPr>
-              <w:t xml:space="preserve">   </w:t>
-            </w:r>
-            <w:r>
-              <w:rPr>
-                <w:rFonts w:hint="eastAsia"/>
-              </w:rPr>
-              <w:t>月</w:t>
-            </w:r>
-            <w:r>
-              <w:rPr>
-                <w:rFonts w:hint="eastAsia"/>
-              </w:rPr>
-              <w:t xml:space="preserve">   </w:t>
-            </w:r>
-            <w:r>
-              <w:rPr>
-                <w:rFonts w:hint="eastAsia"/>
-              </w:rPr>
-              <w:t>日</w:t>
-            </w:r>
           </w:p>
         </w:tc>
         <w:tc>
@@ -4430,7 +4338,7 @@
 </file>
 
 <file path=word/endnotes.xml><?xml version="1.0" encoding="utf-8"?>
-<w:endnotes xmlns:wpc="http://schemas.microsoft.com/office/word/2010/wordprocessingCanvas" xmlns:cx="http://schemas.microsoft.com/office/drawing/2014/chartex" xmlns:cx1="http://schemas.microsoft.com/office/drawing/2015/9/8/chartex" xmlns:cx2="http://schemas.microsoft.com/office/drawing/2015/10/21/chartex" xmlns:cx3="http://schemas.microsoft.com/office/drawing/2016/5/9/chartex" xmlns:cx4="http://schemas.microsoft.com/office/drawing/2016/5/10/chartex" xmlns:cx5="http://schemas.microsoft.com/office/drawing/2016/5/11/chartex" xmlns:cx6="http://schemas.microsoft.com/office/drawing/2016/5/12/chartex" xmlns:cx7="http://schemas.microsoft.com/office/drawing/2016/5/13/chartex" xmlns:cx8="http://schemas.microsoft.com/office/drawing/2016/5/14/chartex" xmlns:mc="http://schemas.openxmlformats.org/markup-compatibility/2006" xmlns:aink="http://schemas.microsoft.com/office/drawing/2016/ink" xmlns:am3d="http://schemas.microsoft.com/office/drawing/2017/model3d" xmlns:o="urn:schemas-microsoft-com:office:office" xmlns:oel="http://schemas.microsoft.com/office/2019/extlst" xmlns:r="http://schemas.openxmlformats.org/officeDocument/2006/relationships" xmlns:m="http://schemas.openxmlformats.org/officeDocument/2006/math" xmlns:v="urn:schemas-microsoft-com:vml" xmlns:wp14="http://schemas.microsoft.com/office/word/2010/wordprocessingDrawing" xmlns:wp="http://schemas.openxmlformats.org/drawingml/2006/wordprocessingDrawing" xmlns:w10="urn:schemas-microsoft-com:office:word" xmlns:w="http://schemas.openxmlformats.org/wordprocessingml/2006/main" xmlns:w14="http://schemas.microsoft.com/office/word/2010/wordml" xmlns:w15="http://schemas.microsoft.com/office/word/2012/wordml" xmlns:w16cex="http://schemas.microsoft.com/office/word/2018/wordml/cex" xmlns:w16cid="http://schemas.microsoft.com/office/word/2016/wordml/cid" xmlns:w16="http://schemas.microsoft.com/office/word/2018/wordml" xmlns:w16sdtdh="http://schemas.microsoft.com/office/word/2020/wordml/sdtdatahash" xmlns:w16se="http://schemas.microsoft.com/office/word/2015/wordml/symex" xmlns:wpg="http://schemas.microsoft.com/office/word/2010/wordprocessingGroup" xmlns:wpi="http://schemas.microsoft.com/office/word/2010/wordprocessingInk" xmlns:wne="http://schemas.microsoft.com/office/word/2006/wordml" xmlns:wps="http://schemas.microsoft.com/office/word/2010/wordprocessingShape" mc:Ignorable="w14 w15 w16se w16cid w16 w16cex w16sdtdh wp14">
+<w:endnotes xmlns:wpc="http://schemas.microsoft.com/office/word/2010/wordprocessingCanvas" xmlns:cx="http://schemas.microsoft.com/office/drawing/2014/chartex" xmlns:cx1="http://schemas.microsoft.com/office/drawing/2015/9/8/chartex" xmlns:cx2="http://schemas.microsoft.com/office/drawing/2015/10/21/chartex" xmlns:cx3="http://schemas.microsoft.com/office/drawing/2016/5/9/chartex" xmlns:cx4="http://schemas.microsoft.com/office/drawing/2016/5/10/chartex" xmlns:cx5="http://schemas.microsoft.com/office/drawing/2016/5/11/chartex" xmlns:cx6="http://schemas.microsoft.com/office/drawing/2016/5/12/chartex" xmlns:cx7="http://schemas.microsoft.com/office/drawing/2016/5/13/chartex" xmlns:cx8="http://schemas.microsoft.com/office/drawing/2016/5/14/chartex" xmlns:mc="http://schemas.openxmlformats.org/markup-compatibility/2006" xmlns:aink="http://schemas.microsoft.com/office/drawing/2016/ink" xmlns:am3d="http://schemas.microsoft.com/office/drawing/2017/model3d" xmlns:o="urn:schemas-microsoft-com:office:office" xmlns:oel="http://schemas.microsoft.com/office/2019/extlst" xmlns:r="http://schemas.openxmlformats.org/officeDocument/2006/relationships" xmlns:m="http://schemas.openxmlformats.org/officeDocument/2006/math" xmlns:v="urn:schemas-microsoft-com:vml" xmlns:wp14="http://schemas.microsoft.com/office/word/2010/wordprocessingDrawing" xmlns:wp="http://schemas.openxmlformats.org/drawingml/2006/wordprocessingDrawing" xmlns:w10="urn:schemas-microsoft-com:office:word" xmlns:w="http://schemas.openxmlformats.org/wordprocessingml/2006/main" xmlns:w14="http://schemas.microsoft.com/office/word/2010/wordml" xmlns:w15="http://schemas.microsoft.com/office/word/2012/wordml" xmlns:w16cex="http://schemas.microsoft.com/office/word/2018/wordml/cex" xmlns:w16cid="http://schemas.microsoft.com/office/word/2016/wordml/cid" xmlns:w16="http://schemas.microsoft.com/office/word/2018/wordml" xmlns:w16du="http://schemas.microsoft.com/office/word/2023/wordml/word16du" xmlns:w16sdtdh="http://schemas.microsoft.com/office/word/2020/wordml/sdtdatahash" xmlns:w16se="http://schemas.microsoft.com/office/word/2015/wordml/symex" xmlns:wpg="http://schemas.microsoft.com/office/word/2010/wordprocessingGroup" xmlns:wpi="http://schemas.microsoft.com/office/word/2010/wordprocessingInk" xmlns:wne="http://schemas.microsoft.com/office/word/2006/wordml" xmlns:wps="http://schemas.microsoft.com/office/word/2010/wordprocessingShape" mc:Ignorable="w14 w15 w16se w16cid w16 w16cex w16sdtdh w16du wp14">
   <w:endnote w:type="separator" w:id="-1">
     <w:p>
       <w:r>
@@ -4449,7 +4357,7 @@
 </file>
 
 <file path=word/footnotes.xml><?xml version="1.0" encoding="utf-8"?>
-<w:footnotes xmlns:wpc="http://schemas.microsoft.com/office/word/2010/wordprocessingCanvas" xmlns:cx="http://schemas.microsoft.com/office/drawing/2014/chartex" xmlns:cx1="http://schemas.microsoft.com/office/drawing/2015/9/8/chartex" xmlns:cx2="http://schemas.microsoft.com/office/drawing/2015/10/21/chartex" xmlns:cx3="http://schemas.microsoft.com/office/drawing/2016/5/9/chartex" xmlns:cx4="http://schemas.microsoft.com/office/drawing/2016/5/10/chartex" xmlns:cx5="http://schemas.microsoft.com/office/drawing/2016/5/11/chartex" xmlns:cx6="http://schemas.microsoft.com/office/drawing/2016/5/12/chartex" xmlns:cx7="http://schemas.microsoft.com/office/drawing/2016/5/13/chartex" xmlns:cx8="http://schemas.microsoft.com/office/drawing/2016/5/14/chartex" xmlns:mc="http://schemas.openxmlformats.org/markup-compatibility/2006" xmlns:aink="http://schemas.microsoft.com/office/drawing/2016/ink" xmlns:am3d="http://schemas.microsoft.com/office/drawing/2017/model3d" xmlns:o="urn:schemas-microsoft-com:office:office" xmlns:oel="http://schemas.microsoft.com/office/2019/extlst" xmlns:r="http://schemas.openxmlformats.org/officeDocument/2006/relationships" xmlns:m="http://schemas.openxmlformats.org/officeDocument/2006/math" xmlns:v="urn:schemas-microsoft-com:vml" xmlns:wp14="http://schemas.microsoft.com/office/word/2010/wordprocessingDrawing" xmlns:wp="http://schemas.openxmlformats.org/drawingml/2006/wordprocessingDrawing" xmlns:w10="urn:schemas-microsoft-com:office:word" xmlns:w="http://schemas.openxmlformats.org/wordprocessingml/2006/main" xmlns:w14="http://schemas.microsoft.com/office/word/2010/wordml" xmlns:w15="http://schemas.microsoft.com/office/word/2012/wordml" xmlns:w16cex="http://schemas.microsoft.com/office/word/2018/wordml/cex" xmlns:w16cid="http://schemas.microsoft.com/office/word/2016/wordml/cid" xmlns:w16="http://schemas.microsoft.com/office/word/2018/wordml" xmlns:w16sdtdh="http://schemas.microsoft.com/office/word/2020/wordml/sdtdatahash" xmlns:w16se="http://schemas.microsoft.com/office/word/2015/wordml/symex" xmlns:wpg="http://schemas.microsoft.com/office/word/2010/wordprocessingGroup" xmlns:wpi="http://schemas.microsoft.com/office/word/2010/wordprocessingInk" xmlns:wne="http://schemas.microsoft.com/office/word/2006/wordml" xmlns:wps="http://schemas.microsoft.com/office/word/2010/wordprocessingShape" mc:Ignorable="w14 w15 w16se w16cid w16 w16cex w16sdtdh wp14">
+<w:footnotes xmlns:wpc="http://schemas.microsoft.com/office/word/2010/wordprocessingCanvas" xmlns:cx="http://schemas.microsoft.com/office/drawing/2014/chartex" xmlns:cx1="http://schemas.microsoft.com/office/drawing/2015/9/8/chartex" xmlns:cx2="http://schemas.microsoft.com/office/drawing/2015/10/21/chartex" xmlns:cx3="http://schemas.microsoft.com/office/drawing/2016/5/9/chartex" xmlns:cx4="http://schemas.microsoft.com/office/drawing/2016/5/10/chartex" xmlns:cx5="http://schemas.microsoft.com/office/drawing/2016/5/11/chartex" xmlns:cx6="http://schemas.microsoft.com/office/drawing/2016/5/12/chartex" xmlns:cx7="http://schemas.microsoft.com/office/drawing/2016/5/13/chartex" xmlns:cx8="http://schemas.microsoft.com/office/drawing/2016/5/14/chartex" xmlns:mc="http://schemas.openxmlformats.org/markup-compatibility/2006" xmlns:aink="http://schemas.microsoft.com/office/drawing/2016/ink" xmlns:am3d="http://schemas.microsoft.com/office/drawing/2017/model3d" xmlns:o="urn:schemas-microsoft-com:office:office" xmlns:oel="http://schemas.microsoft.com/office/2019/extlst" xmlns:r="http://schemas.openxmlformats.org/officeDocument/2006/relationships" xmlns:m="http://schemas.openxmlformats.org/officeDocument/2006/math" xmlns:v="urn:schemas-microsoft-com:vml" xmlns:wp14="http://schemas.microsoft.com/office/word/2010/wordprocessingDrawing" xmlns:wp="http://schemas.openxmlformats.org/drawingml/2006/wordprocessingDrawing" xmlns:w10="urn:schemas-microsoft-com:office:word" xmlns:w="http://schemas.openxmlformats.org/wordprocessingml/2006/main" xmlns:w14="http://schemas.microsoft.com/office/word/2010/wordml" xmlns:w15="http://schemas.microsoft.com/office/word/2012/wordml" xmlns:w16cex="http://schemas.microsoft.com/office/word/2018/wordml/cex" xmlns:w16cid="http://schemas.microsoft.com/office/word/2016/wordml/cid" xmlns:w16="http://schemas.microsoft.com/office/word/2018/wordml" xmlns:w16du="http://schemas.microsoft.com/office/word/2023/wordml/word16du" xmlns:w16sdtdh="http://schemas.microsoft.com/office/word/2020/wordml/sdtdatahash" xmlns:w16se="http://schemas.microsoft.com/office/word/2015/wordml/symex" xmlns:wpg="http://schemas.microsoft.com/office/word/2010/wordprocessingGroup" xmlns:wpi="http://schemas.microsoft.com/office/word/2010/wordprocessingInk" xmlns:wne="http://schemas.microsoft.com/office/word/2006/wordml" xmlns:wps="http://schemas.microsoft.com/office/word/2010/wordprocessingShape" mc:Ignorable="w14 w15 w16se w16cid w16 w16cex w16sdtdh w16du wp14">
   <w:footnote w:type="separator" w:id="-1">
     <w:p>
       <w:r>
@@ -4468,7 +4376,7 @@
 </file>
 
 <file path=word/styles.xml><?xml version="1.0" encoding="utf-8"?>
-<w:styles xmlns:mc="http://schemas.openxmlformats.org/markup-compatibility/2006" xmlns:r="http://schemas.openxmlformats.org/officeDocument/2006/relationships" xmlns:w="http://schemas.openxmlformats.org/wordprocessingml/2006/main" xmlns:w14="http://schemas.microsoft.com/office/word/2010/wordml" xmlns:w15="http://schemas.microsoft.com/office/word/2012/wordml" xmlns:w16cex="http://schemas.microsoft.com/office/word/2018/wordml/cex" xmlns:w16cid="http://schemas.microsoft.com/office/word/2016/wordml/cid" xmlns:w16="http://schemas.microsoft.com/office/word/2018/wordml" xmlns:w16sdtdh="http://schemas.microsoft.com/office/word/2020/wordml/sdtdatahash" xmlns:w16se="http://schemas.microsoft.com/office/word/2015/wordml/symex" mc:Ignorable="w14 w15 w16se w16cid w16 w16cex w16sdtdh">
+<w:styles xmlns:mc="http://schemas.openxmlformats.org/markup-compatibility/2006" xmlns:r="http://schemas.openxmlformats.org/officeDocument/2006/relationships" xmlns:w="http://schemas.openxmlformats.org/wordprocessingml/2006/main" xmlns:w14="http://schemas.microsoft.com/office/word/2010/wordml" xmlns:w15="http://schemas.microsoft.com/office/word/2012/wordml" xmlns:w16cex="http://schemas.microsoft.com/office/word/2018/wordml/cex" xmlns:w16cid="http://schemas.microsoft.com/office/word/2016/wordml/cid" xmlns:w16="http://schemas.microsoft.com/office/word/2018/wordml" xmlns:w16du="http://schemas.microsoft.com/office/word/2023/wordml/word16du" xmlns:w16sdtdh="http://schemas.microsoft.com/office/word/2020/wordml/sdtdatahash" xmlns:w16se="http://schemas.microsoft.com/office/word/2015/wordml/symex" mc:Ignorable="w14 w15 w16se w16cid w16 w16cex w16sdtdh w16du">
   <w:docDefaults>
     <w:rPrDefault>
       <w:rPr>

</xml_diff>